<commit_message>
Running one more discovery script on process schedule
</commit_message>
<xml_diff>
--- a/docs/Project_Console_Verification_Register.docx
+++ b/docs/Project_Console_Verification_Register.docx
@@ -70,6 +70,70 @@
           <w:sz w:val="30"/>
           <w:szCs w:val="30"/>
         </w:rPr>
+        <w:t xml:space="preserve">Probe run — 2026-07-26: resolutions</w:t>
+      </w:r>
+    </w:p>
+    <w:p>
+      <w:pPr>
+        <w:spacing w:after="90"/>
+      </w:pPr>
+      <w:r>
+        <w:rPr>
+          <w:sz w:val="19"/>
+          <w:szCs w:val="19"/>
+        </w:rPr>
+        <w:t xml:space="preserve">A1 (PurchaseActive undercount) — RESOLVED, no issue: committed material is identical with and without the filter (230219 = $2,331,491.80), and all 38,185 POs are active. The filter is a no-op.</w:t>
+      </w:r>
+    </w:p>
+    <w:p>
+      <w:pPr>
+        <w:spacing w:after="90"/>
+      </w:pPr>
+      <w:r>
+        <w:rPr>
+          <w:sz w:val="19"/>
+          <w:szCs w:val="19"/>
+        </w:rPr>
+        <w:t xml:space="preserve">A14 (plan write target) — RESOLVED: tblProjectPMEntry exists with every column the plan form writes.</w:t>
+      </w:r>
+    </w:p>
+    <w:p>
+      <w:pPr>
+        <w:spacing w:after="90"/>
+      </w:pPr>
+      <w:r>
+        <w:rPr>
+          <w:sz w:val="19"/>
+          <w:szCs w:val="19"/>
+        </w:rPr>
+        <w:t xml:space="preserve">A15/A17 — SOFTENED: tblProjectPMEntry has 0 rows (PM side never loaded), so no web-vs-sync key collision today. This also explains the blank Schedule / % Done / run-out / procurement cells on the live board — there is no PM data yet.</w:t>
+      </w:r>
+    </w:p>
+    <w:p>
+      <w:pPr>
+        <w:spacing w:after="90"/>
+      </w:pPr>
+      <w:r>
+        <w:rPr>
+          <w:sz w:val="19"/>
+          <w:szCs w:val="19"/>
+        </w:rPr>
+        <w:t xml:space="preserve">B3 (what is an “activity”) — NARROWED: specs work for objective % now but are coarse; ETO's process-schedule module (operations with estimate/total hours) is the granular candidate, pending a populated/progress check (console_diag_process_schedule.py).</w:t>
+      </w:r>
+    </w:p>
+    <w:p>
+      <w:pPr>
+        <w:pStyle w:val="Heading1"/>
+        <w:spacing w:after="100" w:before="220"/>
+      </w:pPr>
+      <w:r>
+        <w:rPr>
+          <w:b/>
+          <w:bCs/>
+          <w:color w:val="1F3864"/>
+          <w:sz w:val="30"/>
+          <w:szCs w:val="30"/>
+        </w:rPr>
         <w:t xml:space="preserve">A. Assumptions to verify</w:t>
       </w:r>
     </w:p>
@@ -329,7 +393,7 @@
                 <w:sz w:val="18"/>
                 <w:szCs w:val="18"/>
               </w:rPr>
-              <w:t xml:space="preserve">poh.PurchaseActive = 1 selects all valid POs and does NOT exclude completed/received ones</w:t>
+              <w:t xml:space="preserve">✓ RESOLVED — PurchaseActive=1 is a no-op (all 38,185 POs active); committed not undercounted</w:t>
             </w:r>
           </w:p>
         </w:tc>
@@ -362,7 +426,7 @@
                 <w:sz w:val="18"/>
                 <w:szCs w:val="18"/>
               </w:rPr>
-              <w:t xml:space="preserve">If closed POs have PurchaseActive = 0, committed material is understated</w:t>
+              <w:t xml:space="preserve">—</w:t>
             </w:r>
           </w:p>
         </w:tc>
@@ -395,7 +459,7 @@
                 <w:sz w:val="18"/>
                 <w:szCs w:val="18"/>
               </w:rPr>
-              <w:t xml:space="preserve">Compare per-project committed with/without the filter; inspect a fully-received PO's PurchaseActive</w:t>
+              <w:t xml:space="preserve">Closed by console_diag_po_active.py</w:t>
             </w:r>
           </w:p>
         </w:tc>
@@ -2811,7 +2875,7 @@
                 <w:sz w:val="18"/>
                 <w:szCs w:val="18"/>
               </w:rPr>
-              <w:t xml:space="preserve">Reporting.tblProjectPMEntry exists with the assumed columns (PercentComplete, PlannedShipDate, Labour/MaterialRunout, 7 procurement counts, YearWeekKey, FiscalYear, WeekNo, IncludeFlag, Rank, ReRank, MaterialActual/Budget)</w:t>
+              <w:t xml:space="preserve">✓ RESOLVED — tblProjectPMEntry exists with all expected columns (but 0 rows: PM side never loaded)</w:t>
             </w:r>
           </w:p>
         </w:tc>
@@ -2844,7 +2908,7 @@
                 <w:sz w:val="18"/>
                 <w:szCs w:val="18"/>
               </w:rPr>
-              <w:t xml:space="preserve">Live save fails / column mismatch if not</w:t>
+              <w:t xml:space="preserve">—</w:t>
             </w:r>
           </w:p>
         </w:tc>
@@ -2877,7 +2941,7 @@
                 <w:sz w:val="18"/>
                 <w:szCs w:val="18"/>
               </w:rPr>
-              <w:t xml:space="preserve">SELECT the table's columns on the box before first save</w:t>
+              <w:t xml:space="preserve">Closed by console_diag_pmentry.py</w:t>
             </w:r>
           </w:p>
         </w:tc>
@@ -5997,7 +6061,7 @@
                 <w:sz w:val="18"/>
                 <w:szCs w:val="18"/>
               </w:rPr>
-              <w:t xml:space="preserve">console_diag_ncr.py / _costs.py / _cost_source.py</w:t>
+              <w:t xml:space="preserve">console_diag_ncr*.py (4)</w:t>
             </w:r>
           </w:p>
         </w:tc>
@@ -6099,7 +6163,7 @@
                 <w:sz w:val="18"/>
                 <w:szCs w:val="18"/>
               </w:rPr>
-              <w:t xml:space="preserve">console_diag_nc_attribution.py</w:t>
+              <w:t xml:space="preserve">console_diag_plan_activity.py</w:t>
             </w:r>
           </w:p>
         </w:tc>
@@ -6133,7 +6197,7 @@
                 <w:sz w:val="18"/>
                 <w:szCs w:val="18"/>
               </w:rPr>
-              <w:t xml:space="preserve">Origin→department population; derived-discipline spread (A12)</w:t>
+              <w:t xml:space="preserve">Spec list + actuals per spec + process-schedule presence (B3)</w:t>
             </w:r>
           </w:p>
         </w:tc>
@@ -6167,7 +6231,7 @@
                 <w:sz w:val="18"/>
                 <w:szCs w:val="18"/>
               </w:rPr>
-              <w:t xml:space="preserve">Delivered — run pending</w:t>
+              <w:t xml:space="preserve">RUN — specs work; PS module exists</w:t>
             </w:r>
           </w:p>
         </w:tc>
@@ -6202,7 +6266,7 @@
                 <w:sz w:val="18"/>
                 <w:szCs w:val="18"/>
               </w:rPr>
-              <w:t xml:space="preserve">console_diag_material_actual.py</w:t>
+              <w:t xml:space="preserve">console_diag_pmentry.py</w:t>
             </w:r>
           </w:p>
         </w:tc>
@@ -6235,7 +6299,7 @@
                 <w:sz w:val="18"/>
                 <w:szCs w:val="18"/>
               </w:rPr>
-              <w:t xml:space="preserve">Committed vs received per project (A1/A2/B1)</w:t>
+              <w:t xml:space="preserve">Plan write target + columns + week key (A14/A15/A17)</w:t>
             </w:r>
           </w:p>
         </w:tc>
@@ -6268,7 +6332,7 @@
                 <w:sz w:val="18"/>
                 <w:szCs w:val="18"/>
               </w:rPr>
-              <w:t xml:space="preserve">Delivered — run pending</w:t>
+              <w:t xml:space="preserve">RUN — table exists, 0 rows</w:t>
             </w:r>
           </w:p>
         </w:tc>
@@ -6304,7 +6368,7 @@
                 <w:sz w:val="18"/>
                 <w:szCs w:val="18"/>
               </w:rPr>
-              <w:t xml:space="preserve">ETO activity/spec probe</w:t>
+              <w:t xml:space="preserve">console_diag_po_active.py</w:t>
             </w:r>
           </w:p>
         </w:tc>
@@ -6338,7 +6402,7 @@
                 <w:sz w:val="18"/>
                 <w:szCs w:val="18"/>
               </w:rPr>
-              <w:t xml:space="preserve">Per-project spec list + process-schedule population, to fix the allocation grain (B3)</w:t>
+              <w:t xml:space="preserve">PurchaseActive impact on committed (A1)</w:t>
             </w:r>
           </w:p>
         </w:tc>
@@ -6372,7 +6436,7 @@
                 <w:sz w:val="18"/>
                 <w:szCs w:val="18"/>
               </w:rPr>
-              <w:t xml:space="preserve">To write</w:t>
+              <w:t xml:space="preserve">RUN — no-op, A1 closed</w:t>
             </w:r>
           </w:p>
         </w:tc>
@@ -6407,7 +6471,7 @@
                 <w:sz w:val="18"/>
                 <w:szCs w:val="18"/>
               </w:rPr>
-              <w:t xml:space="preserve">Plan PMEntry probe</w:t>
+              <w:t xml:space="preserve">console_diag_process_schedule.py</w:t>
             </w:r>
           </w:p>
         </w:tc>
@@ -6440,7 +6504,7 @@
                 <w:sz w:val="18"/>
                 <w:szCs w:val="18"/>
               </w:rPr>
-              <w:t xml:space="preserve">Confirm tblProjectPMEntry exists + columns + week-key vs sync (A14/A15/A17)</w:t>
+              <w:t xml:space="preserve">Is the process schedule populated + progress-trackable? (B3)</w:t>
             </w:r>
           </w:p>
         </w:tc>
@@ -6473,7 +6537,7 @@
                 <w:sz w:val="18"/>
                 <w:szCs w:val="18"/>
               </w:rPr>
-              <w:t xml:space="preserve">To write</w:t>
+              <w:t xml:space="preserve">Delivered — run pending</w:t>
             </w:r>
           </w:p>
         </w:tc>
@@ -6509,7 +6573,7 @@
                 <w:sz w:val="18"/>
                 <w:szCs w:val="18"/>
               </w:rPr>
-              <w:t xml:space="preserve">PO PurchaseActive probe</w:t>
+              <w:t xml:space="preserve">console_diag_nc_attribution.py</w:t>
             </w:r>
           </w:p>
         </w:tc>
@@ -6543,7 +6607,7 @@
                 <w:sz w:val="18"/>
                 <w:szCs w:val="18"/>
               </w:rPr>
-              <w:t xml:space="preserve">Committed with/without the active filter (A1)</w:t>
+              <w:t xml:space="preserve">Origin→dept population; derived-discipline spread (A12)</w:t>
             </w:r>
           </w:p>
         </w:tc>
@@ -6577,7 +6641,108 @@
                 <w:sz w:val="18"/>
                 <w:szCs w:val="18"/>
               </w:rPr>
-              <w:t xml:space="preserve">To write (fold into material probe)</w:t>
+              <w:t xml:space="preserve">Delivered — run pending</w:t>
+            </w:r>
+          </w:p>
+        </w:tc>
+      </w:tr>
+      <w:tr>
+        <w:tc>
+          <w:tcPr>
+            <w:tcW w:type="dxa" w:w="3600"/>
+            <w:tcBorders>
+              <w:top w:val="single" w:color="C9D2E0" w:sz="4"/>
+              <w:left w:val="single" w:color="C9D2E0" w:sz="4"/>
+              <w:bottom w:val="single" w:color="C9D2E0" w:sz="4"/>
+              <w:right w:val="single" w:color="C9D2E0" w:sz="4"/>
+            </w:tcBorders>
+            <w:tcMar>
+              <w:top w:type="dxa" w:w="60"/>
+              <w:left w:type="dxa" w:w="90"/>
+              <w:bottom w:type="dxa" w:w="60"/>
+              <w:right w:type="dxa" w:w="90"/>
+            </w:tcMar>
+          </w:tcPr>
+          <w:p>
+            <w:pPr>
+              <w:spacing w:after="0"/>
+            </w:pPr>
+            <w:r>
+              <w:rPr>
+                <w:b w:val="false"/>
+                <w:bCs w:val="false"/>
+                <w:i w:val="false"/>
+                <w:iCs w:val="false"/>
+                <w:sz w:val="18"/>
+                <w:szCs w:val="18"/>
+              </w:rPr>
+              <w:t xml:space="preserve">console_diag_material_actual.py</w:t>
+            </w:r>
+          </w:p>
+        </w:tc>
+        <w:tc>
+          <w:tcPr>
+            <w:tcW w:type="dxa" w:w="7360"/>
+            <w:tcBorders>
+              <w:top w:val="single" w:color="C9D2E0" w:sz="4"/>
+              <w:left w:val="single" w:color="C9D2E0" w:sz="4"/>
+              <w:bottom w:val="single" w:color="C9D2E0" w:sz="4"/>
+              <w:right w:val="single" w:color="C9D2E0" w:sz="4"/>
+            </w:tcBorders>
+            <w:tcMar>
+              <w:top w:type="dxa" w:w="60"/>
+              <w:left w:type="dxa" w:w="90"/>
+              <w:bottom w:type="dxa" w:w="60"/>
+              <w:right w:type="dxa" w:w="90"/>
+            </w:tcMar>
+          </w:tcPr>
+          <w:p>
+            <w:pPr>
+              <w:spacing w:after="0"/>
+            </w:pPr>
+            <w:r>
+              <w:rPr>
+                <w:b w:val="false"/>
+                <w:bCs w:val="false"/>
+                <w:i w:val="false"/>
+                <w:iCs w:val="false"/>
+                <w:sz w:val="18"/>
+                <w:szCs w:val="18"/>
+              </w:rPr>
+              <w:t xml:space="preserve">Committed vs received per project (A2/B1)</w:t>
+            </w:r>
+          </w:p>
+        </w:tc>
+        <w:tc>
+          <w:tcPr>
+            <w:tcW w:type="dxa" w:w="2000"/>
+            <w:tcBorders>
+              <w:top w:val="single" w:color="C9D2E0" w:sz="4"/>
+              <w:left w:val="single" w:color="C9D2E0" w:sz="4"/>
+              <w:bottom w:val="single" w:color="C9D2E0" w:sz="4"/>
+              <w:right w:val="single" w:color="C9D2E0" w:sz="4"/>
+            </w:tcBorders>
+            <w:tcMar>
+              <w:top w:type="dxa" w:w="60"/>
+              <w:left w:type="dxa" w:w="90"/>
+              <w:bottom w:type="dxa" w:w="60"/>
+              <w:right w:type="dxa" w:w="90"/>
+            </w:tcMar>
+          </w:tcPr>
+          <w:p>
+            <w:pPr>
+              <w:spacing w:after="0"/>
+            </w:pPr>
+            <w:r>
+              <w:rPr>
+                <w:b w:val="false"/>
+                <w:bCs w:val="false"/>
+                <w:i w:val="false"/>
+                <w:iCs w:val="false"/>
+                <w:sz w:val="18"/>
+                <w:szCs w:val="18"/>
+              </w:rPr>
+              <w:t xml:space="preserve">Delivered — run pending</w:t>
             </w:r>
           </w:p>
         </w:tc>

</xml_diff>

<commit_message>
Added date logic to PO queries and added a Buyer centric PO Report
</commit_message>
<xml_diff>
--- a/docs/Project_Console_Verification_Register.docx
+++ b/docs/Project_Console_Verification_Register.docx
@@ -118,7 +118,7 @@
           <w:sz w:val="19"/>
           <w:szCs w:val="19"/>
         </w:rPr>
-        <w:t xml:space="preserve">B3 (what is an “activity”) — NARROWED: specs work for objective % now but are coarse; ETO's process-schedule module (operations with estimate/total hours) is the granular candidate, pending a populated/progress check (console_diag_process_schedule.py).</w:t>
+        <w:t xml:space="preserve">B3 (what is an “activity”) — RESOLVED: anchor on SPEC. ETO's process schedule is broad (3,774 headers / 143 projects) but is a parts/fabrication tracker — hours=0, no durations, Sequence always 1 — not a plan. So the PM picks from the spec list (tblSpec); labour + material attach per spec (objective %); sub-spec units of work are console-authored.</w:t>
       </w:r>
     </w:p>
     <w:p>
@@ -4728,7 +4728,7 @@
                 <w:sz w:val="18"/>
                 <w:szCs w:val="18"/>
               </w:rPr>
-              <w:t xml:space="preserve">Plan “activity” = which ETO entity? (current thread)</w:t>
+              <w:t xml:space="preserve">Plan “activity” grain</w:t>
             </w:r>
           </w:p>
         </w:tc>
@@ -4761,7 +4761,7 @@
                 <w:sz w:val="18"/>
                 <w:szCs w:val="18"/>
               </w:rPr>
-              <w:t xml:space="preserve">Lean: spec (tblSpec) × discipline (ties to both labour + material actuals); alternatives: Hour Description (category) or process-schedule task (sparse)</w:t>
+              <w:t xml:space="preserve">✓ RESOLVED — spec (ETO anchor from tblSpec; objective % from labour+material) + console-authored sub-units. Process schedule rejected (parts tracker, no durations).</w:t>
             </w:r>
           </w:p>
         </w:tc>
@@ -4794,7 +4794,7 @@
                 <w:sz w:val="18"/>
                 <w:szCs w:val="18"/>
               </w:rPr>
-              <w:t xml:space="preserve">ETO activity/spec probe (to write)</w:t>
+              <w:t xml:space="preserve">—</w:t>
             </w:r>
           </w:p>
         </w:tc>
@@ -6504,7 +6504,7 @@
                 <w:sz w:val="18"/>
                 <w:szCs w:val="18"/>
               </w:rPr>
-              <w:t xml:space="preserve">Is the process schedule populated + progress-trackable? (B3)</w:t>
+              <w:t xml:space="preserve">Is the process schedule a usable plan source? (B3)</w:t>
             </w:r>
           </w:p>
         </w:tc>
@@ -6537,7 +6537,7 @@
                 <w:sz w:val="18"/>
                 <w:szCs w:val="18"/>
               </w:rPr>
-              <w:t xml:space="preserve">Delivered — run pending</w:t>
+              <w:t xml:space="preserve">RUN — no (parts tracker); spec chosen</w:t>
             </w:r>
           </w:p>
         </w:tc>

</xml_diff>